<commit_message>
Docs: regenerate all four Word docs at v0.5.7; refresh progress report; fix generator dropping the report
</commit_message>
<xml_diff>
--- a/docs/Vector-Architecture.docx
+++ b/docs/Vector-Architecture.docx
@@ -25,7 +25,7 @@
           <w:sz w:val="22"/>
           <w:szCs w:val="22"/>
         </w:rPr>
-        <w:t xml:space="preserve">Detailed system design for the pre-generation security diagnosis engine (v0.5.6, AWS-only, rule-based, offline).</w:t>
+        <w:t xml:space="preserve">Detailed system design for the pre-generation security diagnosis engine (v0.5.7, AWS-only, rule-based, offline).</w:t>
       </w:r>
     </w:p>
     <w:p>
@@ -2077,6 +2077,19 @@
           <w:szCs w:val="22"/>
         </w:rPr>
         <w:t xml:space="preserve">• 0.5.6 scope guard tightened; risky-only prompts remain in scope; demo cache-buster.</w:t>
+      </w:r>
+    </w:p>
+    <w:p>
+      <w:pPr>
+        <w:spacing w:before="0" w:after="60"/>
+        <w:ind w:left="360" w:hanging="360"/>
+      </w:pPr>
+      <w:r>
+        <w:rPr>
+          <w:sz w:val="22"/>
+          <w:szCs w:val="22"/>
+        </w:rPr>
+        <w:t xml:space="preserve">• 0.5.7 deep scan hides the rule answer then reveals the merged result at once; a clean AI result shows a no-issues state; the improved prompt is hidden for out-of-scope input.</w:t>
       </w:r>
     </w:p>
     <w:sectPr>

</xml_diff>